<commit_message>
Fold all three contributions into one shared submission doc
Co-Authored-By: Claude Sonnet 5 <noreply@anthropic.com>
</commit_message>
<xml_diff>
--- a/docs/poc_validation.docx
+++ b/docs/poc_validation.docx
@@ -8,37 +8,6 @@
       </w:pPr>
       <w:r>
         <w:t>Proof-of-Concept Validation — Core Processing Function</w:t>
-      </w:r>
-    </w:p>
-    <w:p>
-      <w:r>
-        <w:rPr>
-          <w:b/>
-        </w:rPr>
-        <w:t xml:space="preserve">Student: </w:t>
-      </w:r>
-      <w:r>
-        <w:t xml:space="preserve">[your name]   </w:t>
-      </w:r>
-      <w:r>
-        <w:rPr>
-          <w:b/>
-        </w:rPr>
-        <w:t xml:space="preserve">Roll No.: </w:t>
-      </w:r>
-      <w:r>
-        <w:t>[fill in]</w:t>
-      </w:r>
-    </w:p>
-    <w:p>
-      <w:r>
-        <w:rPr>
-          <w:b/>
-        </w:rPr>
-        <w:t xml:space="preserve">Project: </w:t>
-      </w:r>
-      <w:r>
-        <w:t>Simulation-First Development and Validation Platform for a Formula Student Driverless Autonomy Stack</w:t>
       </w:r>
     </w:p>
     <w:p>
@@ -59,6 +28,17 @@
       </w:r>
       <w:r>
         <w:t>Dr. Makarand Govind Kulkarni</w:t>
+      </w:r>
+    </w:p>
+    <w:p>
+      <w:r>
+        <w:rPr>
+          <w:b/>
+        </w:rPr>
+        <w:t xml:space="preserve">Project: </w:t>
+      </w:r>
+      <w:r>
+        <w:t>Simulation-First Development and Validation Platform for a Formula Student Driverless Autonomy Stack</w:t>
       </w:r>
     </w:p>
     <w:p>
@@ -676,15 +656,40 @@
     </w:p>
     <w:p>
       <w:r>
-        <w:rPr>
-          <w:i/>
-        </w:rPr>
-        <w:t>[Fill in before submitting — required per student even on a shared artifact. Example:]</w:t>
+        <w:t>Submitted as a shared artifact. Each team member’s individual contribution to this specific validation test is stated below.</w:t>
       </w:r>
     </w:p>
     <w:p>
       <w:r>
-        <w:t>I implemented/ran/analysed: [e.g., "the EKF sensor-fusion configuration (ekf_params.yaml, wheel_odometry.py, imu_frontend.py) and the Monte-Carlo sweep harness used to generate this result"]. State only the parts you personally did — do not copy a teammate’s sentence here.</w:t>
+        <w:rPr>
+          <w:b/>
+        </w:rPr>
+        <w:t xml:space="preserve">Rishi Satish — EKF / sensor-fusion configuration. </w:t>
+      </w:r>
+      <w:r>
+        <w:t>Implemented the EKF sensor-fusion setup validated by this test: the filter configuration (ekf_params.yaml), the wheel-odometry adapter (wheel_odometry.py), and the IMU frontend that corrects the simulator’s covariance output so the filter weighs each sensor correctly (imu_frontend.py).</w:t>
+      </w:r>
+    </w:p>
+    <w:p>
+      <w:r>
+        <w:rPr>
+          <w:b/>
+        </w:rPr>
+        <w:t xml:space="preserve">Harshvardhan Singh — Monte-Carlo sweep execution. </w:t>
+      </w:r>
+      <w:r>
+        <w:t>Ran the drift sweep this test is based on: configuring and executing run_sweeps.py across the six odometry-drift levels and eight seeded episodes per level, including the per-episode ROS_DOMAIN_ID rotation used to keep episodes independent, and collecting the raw results into skidpad_odom_drift_sweep.csv.</w:t>
+      </w:r>
+    </w:p>
+    <w:p>
+      <w:r>
+        <w:rPr>
+          <w:b/>
+        </w:rPr>
+        <w:t xml:space="preserve">Ayon Majumdar — Statistical analysis and validation. </w:t>
+      </w:r>
+      <w:r>
+        <w:t>Analysed the sweep results: computed the Wilson-score confidence intervals and generated skidpad_odom_drift_sweep.png via plot_sweeps.py, and ran the model-fidelity cross-check comparing the SIL model’s predicted error (0.32 m) against the full simulator’s measured error (0.33 m) to validate the cheaper test model.</w:t>
       </w:r>
     </w:p>
     <w:p/>

</xml_diff>